<commit_message>
feat(quick-report): generate summary tables programmatically
Port programmatic summary table creation from reference CLI. Replace template Jinja loop rendering in vi_summary.py and cbm_summary.py with python-docx dynamic table generation. Add format_table_cell helper in utils.py and bump version to v1.5.0.
</commit_message>
<xml_diff>
--- a/templates/QUICK REPORT/1. FRONT PAGE TEMPLATE IR BOX Jinja2 updated.docx
+++ b/templates/QUICK REPORT/1. FRONT PAGE TEMPLATE IR BOX Jinja2 updated.docx
@@ -1,6 +1,6 @@
 
 <file path=word/document.xml><?xml version="1.0" encoding="utf-8"?>
-<w:document xmlns:wpc="http://schemas.microsoft.com/office/word/2010/wordprocessingCanvas" xmlns:cx="http://schemas.microsoft.com/office/drawing/2014/chartex" xmlns:cx1="http://schemas.microsoft.com/office/drawing/2015/9/8/chartex" xmlns:cx2="http://schemas.microsoft.com/office/drawing/2015/10/21/chartex" xmlns:cx3="http://schemas.microsoft.com/office/drawing/2016/5/9/chartex" xmlns:cx4="http://schemas.microsoft.com/office/drawing/2016/5/10/chartex" xmlns:cx5="http://schemas.microsoft.com/office/drawing/2016/5/11/chartex" xmlns:cx6="http://schemas.microsoft.com/office/drawing/2016/5/12/chartex" xmlns:cx7="http://schemas.microsoft.com/office/drawing/2016/5/13/chartex" xmlns:cx8="http://schemas.microsoft.com/office/drawing/2016/5/14/chartex" xmlns:mc="http://schemas.openxmlformats.org/markup-compatibility/2006" xmlns:aink="http://schemas.microsoft.com/office/drawing/2016/ink" xmlns:am3d="http://schemas.microsoft.com/office/drawing/2017/model3d" xmlns:o="urn:schemas-microsoft-com:office:office" xmlns:oel="http://schemas.microsoft.com/office/2019/extlst" xmlns:r="http://schemas.openxmlformats.org/officeDocument/2006/relationships" xmlns:m="http://schemas.openxmlformats.org/officeDocument/2006/math" xmlns:v="urn:schemas-microsoft-com:vml" xmlns:wp14="http://schemas.microsoft.com/office/word/2010/wordprocessingDrawing" xmlns:wp="http://schemas.openxmlformats.org/drawingml/2006/wordprocessingDrawing" xmlns:w10="urn:schemas-microsoft-com:office:word" xmlns:w="http://schemas.openxmlformats.org/wordprocessingml/2006/main" xmlns:w14="http://schemas.microsoft.com/office/word/2010/wordml" xmlns:w15="http://schemas.microsoft.com/office/word/2012/wordml" xmlns:w16cex="http://schemas.microsoft.com/office/word/2018/wordml/cex" xmlns:w16cid="http://schemas.microsoft.com/office/word/2016/wordml/cid" xmlns:w16="http://schemas.microsoft.com/office/word/2018/wordml" xmlns:w16du="http://schemas.microsoft.com/office/word/2023/wordml/word16du" xmlns:w16sdtdh="http://schemas.microsoft.com/office/word/2020/wordml/sdtdatahash" xmlns:w16sdtfl="http://schemas.microsoft.com/office/word/2024/wordml/sdtformatlock" xmlns:w16se="http://schemas.microsoft.com/office/word/2015/wordml/symex" xmlns:wpg="http://schemas.microsoft.com/office/word/2010/wordprocessingGroup" xmlns:wpi="http://schemas.microsoft.com/office/word/2010/wordprocessingInk" xmlns:wne="http://schemas.microsoft.com/office/word/2006/wordml" xmlns:wps="http://schemas.microsoft.com/office/word/2010/wordprocessingShape" mc:Ignorable="w14 w15 w16se w16cid w16 w16cex w16sdtdh w16sdtfl w16du wp14">
+<w:document xmlns:wpc="http://schemas.microsoft.com/office/word/2010/wordprocessingCanvas" xmlns:cx="http://schemas.microsoft.com/office/drawing/2014/chartex" xmlns:cx1="http://schemas.microsoft.com/office/drawing/2015/9/8/chartex" xmlns:cx2="http://schemas.microsoft.com/office/drawing/2015/10/21/chartex" xmlns:cx3="http://schemas.microsoft.com/office/drawing/2016/5/9/chartex" xmlns:cx4="http://schemas.microsoft.com/office/drawing/2016/5/10/chartex" xmlns:cx5="http://schemas.microsoft.com/office/drawing/2016/5/11/chartex" xmlns:cx6="http://schemas.microsoft.com/office/drawing/2016/5/12/chartex" xmlns:cx7="http://schemas.microsoft.com/office/drawing/2016/5/13/chartex" xmlns:cx8="http://schemas.microsoft.com/office/drawing/2016/5/14/chartex" xmlns:mc="http://schemas.openxmlformats.org/markup-compatibility/2006" xmlns:aink="http://schemas.microsoft.com/office/drawing/2016/ink" xmlns:am3d="http://schemas.microsoft.com/office/drawing/2017/model3d" xmlns:o="urn:schemas-microsoft-com:office:office" xmlns:oel="http://schemas.microsoft.com/office/2019/extlst" xmlns:r="http://schemas.openxmlformats.org/officeDocument/2006/relationships" xmlns:m="http://schemas.openxmlformats.org/officeDocument/2006/math" xmlns:v="urn:schemas-microsoft-com:vml" xmlns:wp14="http://schemas.microsoft.com/office/word/2010/wordprocessingDrawing" xmlns:wp="http://schemas.openxmlformats.org/drawingml/2006/wordprocessingDrawing" xmlns:w10="urn:schemas-microsoft-com:office:word" xmlns:w="http://schemas.openxmlformats.org/wordprocessingml/2006/main" xmlns:w14="http://schemas.microsoft.com/office/word/2010/wordml" xmlns:w15="http://schemas.microsoft.com/office/word/2012/wordml" xmlns:w16cei="http://schemas.microsoft.com/office/word/2026/wordml/cei" xmlns:w16cex="http://schemas.microsoft.com/office/word/2018/wordml/cex" xmlns:w16cid="http://schemas.microsoft.com/office/word/2016/wordml/cid" xmlns:w16="http://schemas.microsoft.com/office/word/2018/wordml" xmlns:w16du="http://schemas.microsoft.com/office/word/2023/wordml/word16du" xmlns:w16sdtdh="http://schemas.microsoft.com/office/word/2020/wordml/sdtdatahash" xmlns:w16sdtfl="http://schemas.microsoft.com/office/word/2024/wordml/sdtformatlock" xmlns:w16se="http://schemas.microsoft.com/office/word/2015/wordml/symex" xmlns:wpg="http://schemas.microsoft.com/office/word/2010/wordprocessingGroup" xmlns:wpi="http://schemas.microsoft.com/office/word/2010/wordprocessingInk" xmlns:wne="http://schemas.microsoft.com/office/word/2006/wordml" xmlns:wps="http://schemas.microsoft.com/office/word/2010/wordprocessingShape" mc:Ignorable="w14 w15 w16se w16cid w16 w16cex w16sdtdh w16sdtfl w16du wp14">
   <w:body>
     <w:tbl>
       <w:tblPr>
@@ -166,7 +166,7 @@
                 <w:lang w:eastAsia="en-MY"/>
               </w:rPr>
               <w:drawing>
-                <wp:inline distT="0" distB="0" distL="0" distR="0" wp14:anchorId="7D93C327" wp14:editId="7A75436C">
+                <wp:inline distT="0" distB="0" distL="0" distR="0" wp14:anchorId="7D93C327" wp14:editId="041B1214">
                   <wp:extent cx="2286000" cy="649224"/>
                   <wp:effectExtent l="0" t="0" r="0" b="0"/>
                   <wp:docPr id="4" name="Picture 4" descr="D:\Work Documents\Template\Logo\New EET Logo Final _Color.png"/>
@@ -308,7 +308,7 @@
           <w:sz w:val="32"/>
           <w:szCs w:val="32"/>
         </w:rPr>
-        <w:t>JOHOR</w:t>
+        <w:t>{{ SUBSTATION.STATE }}</w:t>
       </w:r>
       <w:r>
         <w:rPr>
@@ -347,7 +347,7 @@
           <w:sz w:val="32"/>
           <w:szCs w:val="32"/>
         </w:rPr>
-        <w:t>JOHOR</w:t>
+        <w:t>{{ SUBSTATION.STATE }}</w:t>
       </w:r>
     </w:p>
     <w:p>
@@ -819,13 +819,7 @@
               <w:rPr>
                 <w:rFonts w:cstheme="minorHAnsi"/>
               </w:rPr>
-              <w:t>substation</w:t>
-            </w:r>
-            <w:r>
-              <w:rPr>
-                <w:rFonts w:cstheme="minorHAnsi"/>
-              </w:rPr>
-              <w:t>.t</w:t>
+              <w:t>substation.t</w:t>
             </w:r>
             <w:r>
               <w:rPr>
@@ -977,13 +971,7 @@
               <w:rPr>
                 <w:rFonts w:cstheme="minorHAnsi"/>
               </w:rPr>
-              <w:t>substation</w:t>
-            </w:r>
-            <w:r>
-              <w:rPr>
-                <w:rFonts w:cstheme="minorHAnsi"/>
-              </w:rPr>
-              <w:t>.state</w:t>
+              <w:t>substation.state</w:t>
             </w:r>
             <w:proofErr w:type="spellEnd"/>
             <w:r>
@@ -2041,7 +2029,7 @@
 </file>
 
 <file path=word/endnotes.xml><?xml version="1.0" encoding="utf-8"?>
-<w:endnotes xmlns:wpc="http://schemas.microsoft.com/office/word/2010/wordprocessingCanvas" xmlns:cx="http://schemas.microsoft.com/office/drawing/2014/chartex" xmlns:cx1="http://schemas.microsoft.com/office/drawing/2015/9/8/chartex" xmlns:cx2="http://schemas.microsoft.com/office/drawing/2015/10/21/chartex" xmlns:cx3="http://schemas.microsoft.com/office/drawing/2016/5/9/chartex" xmlns:cx4="http://schemas.microsoft.com/office/drawing/2016/5/10/chartex" xmlns:cx5="http://schemas.microsoft.com/office/drawing/2016/5/11/chartex" xmlns:cx6="http://schemas.microsoft.com/office/drawing/2016/5/12/chartex" xmlns:cx7="http://schemas.microsoft.com/office/drawing/2016/5/13/chartex" xmlns:cx8="http://schemas.microsoft.com/office/drawing/2016/5/14/chartex" xmlns:mc="http://schemas.openxmlformats.org/markup-compatibility/2006" xmlns:aink="http://schemas.microsoft.com/office/drawing/2016/ink" xmlns:am3d="http://schemas.microsoft.com/office/drawing/2017/model3d" xmlns:o="urn:schemas-microsoft-com:office:office" xmlns:oel="http://schemas.microsoft.com/office/2019/extlst" xmlns:r="http://schemas.openxmlformats.org/officeDocument/2006/relationships" xmlns:m="http://schemas.openxmlformats.org/officeDocument/2006/math" xmlns:v="urn:schemas-microsoft-com:vml" xmlns:wp14="http://schemas.microsoft.com/office/word/2010/wordprocessingDrawing" xmlns:wp="http://schemas.openxmlformats.org/drawingml/2006/wordprocessingDrawing" xmlns:w10="urn:schemas-microsoft-com:office:word" xmlns:w="http://schemas.openxmlformats.org/wordprocessingml/2006/main" xmlns:w14="http://schemas.microsoft.com/office/word/2010/wordml" xmlns:w15="http://schemas.microsoft.com/office/word/2012/wordml" xmlns:w16cex="http://schemas.microsoft.com/office/word/2018/wordml/cex" xmlns:w16cid="http://schemas.microsoft.com/office/word/2016/wordml/cid" xmlns:w16="http://schemas.microsoft.com/office/word/2018/wordml" xmlns:w16du="http://schemas.microsoft.com/office/word/2023/wordml/word16du" xmlns:w16sdtdh="http://schemas.microsoft.com/office/word/2020/wordml/sdtdatahash" xmlns:w16sdtfl="http://schemas.microsoft.com/office/word/2024/wordml/sdtformatlock" xmlns:w16se="http://schemas.microsoft.com/office/word/2015/wordml/symex" xmlns:wpg="http://schemas.microsoft.com/office/word/2010/wordprocessingGroup" xmlns:wpi="http://schemas.microsoft.com/office/word/2010/wordprocessingInk" xmlns:wne="http://schemas.microsoft.com/office/word/2006/wordml" xmlns:wps="http://schemas.microsoft.com/office/word/2010/wordprocessingShape" mc:Ignorable="w14 w15 w16se w16cid w16 w16cex w16sdtdh w16sdtfl w16du wp14">
+<w:endnotes xmlns:wpc="http://schemas.microsoft.com/office/word/2010/wordprocessingCanvas" xmlns:cx="http://schemas.microsoft.com/office/drawing/2014/chartex" xmlns:cx1="http://schemas.microsoft.com/office/drawing/2015/9/8/chartex" xmlns:cx2="http://schemas.microsoft.com/office/drawing/2015/10/21/chartex" xmlns:cx3="http://schemas.microsoft.com/office/drawing/2016/5/9/chartex" xmlns:cx4="http://schemas.microsoft.com/office/drawing/2016/5/10/chartex" xmlns:cx5="http://schemas.microsoft.com/office/drawing/2016/5/11/chartex" xmlns:cx6="http://schemas.microsoft.com/office/drawing/2016/5/12/chartex" xmlns:cx7="http://schemas.microsoft.com/office/drawing/2016/5/13/chartex" xmlns:cx8="http://schemas.microsoft.com/office/drawing/2016/5/14/chartex" xmlns:mc="http://schemas.openxmlformats.org/markup-compatibility/2006" xmlns:aink="http://schemas.microsoft.com/office/drawing/2016/ink" xmlns:am3d="http://schemas.microsoft.com/office/drawing/2017/model3d" xmlns:o="urn:schemas-microsoft-com:office:office" xmlns:oel="http://schemas.microsoft.com/office/2019/extlst" xmlns:r="http://schemas.openxmlformats.org/officeDocument/2006/relationships" xmlns:m="http://schemas.openxmlformats.org/officeDocument/2006/math" xmlns:v="urn:schemas-microsoft-com:vml" xmlns:wp14="http://schemas.microsoft.com/office/word/2010/wordprocessingDrawing" xmlns:wp="http://schemas.openxmlformats.org/drawingml/2006/wordprocessingDrawing" xmlns:w10="urn:schemas-microsoft-com:office:word" xmlns:w="http://schemas.openxmlformats.org/wordprocessingml/2006/main" xmlns:w14="http://schemas.microsoft.com/office/word/2010/wordml" xmlns:w15="http://schemas.microsoft.com/office/word/2012/wordml" xmlns:w16cei="http://schemas.microsoft.com/office/word/2026/wordml/cei" xmlns:w16cex="http://schemas.microsoft.com/office/word/2018/wordml/cex" xmlns:w16cid="http://schemas.microsoft.com/office/word/2016/wordml/cid" xmlns:w16="http://schemas.microsoft.com/office/word/2018/wordml" xmlns:w16du="http://schemas.microsoft.com/office/word/2023/wordml/word16du" xmlns:w16sdtdh="http://schemas.microsoft.com/office/word/2020/wordml/sdtdatahash" xmlns:w16sdtfl="http://schemas.microsoft.com/office/word/2024/wordml/sdtformatlock" xmlns:w16se="http://schemas.microsoft.com/office/word/2015/wordml/symex" xmlns:wpg="http://schemas.microsoft.com/office/word/2010/wordprocessingGroup" xmlns:wpi="http://schemas.microsoft.com/office/word/2010/wordprocessingInk" xmlns:wne="http://schemas.microsoft.com/office/word/2006/wordml" xmlns:wps="http://schemas.microsoft.com/office/word/2010/wordprocessingShape" mc:Ignorable="w14 w15 w16se w16cid w16 w16cex w16sdtdh w16sdtfl w16du wp14">
   <w:endnote w:type="separator" w:id="-1">
     <w:p>
       <w:pPr>
@@ -2066,7 +2054,7 @@
 </file>
 
 <file path=word/footnotes.xml><?xml version="1.0" encoding="utf-8"?>
-<w:footnotes xmlns:wpc="http://schemas.microsoft.com/office/word/2010/wordprocessingCanvas" xmlns:cx="http://schemas.microsoft.com/office/drawing/2014/chartex" xmlns:cx1="http://schemas.microsoft.com/office/drawing/2015/9/8/chartex" xmlns:cx2="http://schemas.microsoft.com/office/drawing/2015/10/21/chartex" xmlns:cx3="http://schemas.microsoft.com/office/drawing/2016/5/9/chartex" xmlns:cx4="http://schemas.microsoft.com/office/drawing/2016/5/10/chartex" xmlns:cx5="http://schemas.microsoft.com/office/drawing/2016/5/11/chartex" xmlns:cx6="http://schemas.microsoft.com/office/drawing/2016/5/12/chartex" xmlns:cx7="http://schemas.microsoft.com/office/drawing/2016/5/13/chartex" xmlns:cx8="http://schemas.microsoft.com/office/drawing/2016/5/14/chartex" xmlns:mc="http://schemas.openxmlformats.org/markup-compatibility/2006" xmlns:aink="http://schemas.microsoft.com/office/drawing/2016/ink" xmlns:am3d="http://schemas.microsoft.com/office/drawing/2017/model3d" xmlns:o="urn:schemas-microsoft-com:office:office" xmlns:oel="http://schemas.microsoft.com/office/2019/extlst" xmlns:r="http://schemas.openxmlformats.org/officeDocument/2006/relationships" xmlns:m="http://schemas.openxmlformats.org/officeDocument/2006/math" xmlns:v="urn:schemas-microsoft-com:vml" xmlns:wp14="http://schemas.microsoft.com/office/word/2010/wordprocessingDrawing" xmlns:wp="http://schemas.openxmlformats.org/drawingml/2006/wordprocessingDrawing" xmlns:w10="urn:schemas-microsoft-com:office:word" xmlns:w="http://schemas.openxmlformats.org/wordprocessingml/2006/main" xmlns:w14="http://schemas.microsoft.com/office/word/2010/wordml" xmlns:w15="http://schemas.microsoft.com/office/word/2012/wordml" xmlns:w16cex="http://schemas.microsoft.com/office/word/2018/wordml/cex" xmlns:w16cid="http://schemas.microsoft.com/office/word/2016/wordml/cid" xmlns:w16="http://schemas.microsoft.com/office/word/2018/wordml" xmlns:w16du="http://schemas.microsoft.com/office/word/2023/wordml/word16du" xmlns:w16sdtdh="http://schemas.microsoft.com/office/word/2020/wordml/sdtdatahash" xmlns:w16sdtfl="http://schemas.microsoft.com/office/word/2024/wordml/sdtformatlock" xmlns:w16se="http://schemas.microsoft.com/office/word/2015/wordml/symex" xmlns:wpg="http://schemas.microsoft.com/office/word/2010/wordprocessingGroup" xmlns:wpi="http://schemas.microsoft.com/office/word/2010/wordprocessingInk" xmlns:wne="http://schemas.microsoft.com/office/word/2006/wordml" xmlns:wps="http://schemas.microsoft.com/office/word/2010/wordprocessingShape" mc:Ignorable="w14 w15 w16se w16cid w16 w16cex w16sdtdh w16sdtfl w16du wp14">
+<w:footnotes xmlns:wpc="http://schemas.microsoft.com/office/word/2010/wordprocessingCanvas" xmlns:cx="http://schemas.microsoft.com/office/drawing/2014/chartex" xmlns:cx1="http://schemas.microsoft.com/office/drawing/2015/9/8/chartex" xmlns:cx2="http://schemas.microsoft.com/office/drawing/2015/10/21/chartex" xmlns:cx3="http://schemas.microsoft.com/office/drawing/2016/5/9/chartex" xmlns:cx4="http://schemas.microsoft.com/office/drawing/2016/5/10/chartex" xmlns:cx5="http://schemas.microsoft.com/office/drawing/2016/5/11/chartex" xmlns:cx6="http://schemas.microsoft.com/office/drawing/2016/5/12/chartex" xmlns:cx7="http://schemas.microsoft.com/office/drawing/2016/5/13/chartex" xmlns:cx8="http://schemas.microsoft.com/office/drawing/2016/5/14/chartex" xmlns:mc="http://schemas.openxmlformats.org/markup-compatibility/2006" xmlns:aink="http://schemas.microsoft.com/office/drawing/2016/ink" xmlns:am3d="http://schemas.microsoft.com/office/drawing/2017/model3d" xmlns:o="urn:schemas-microsoft-com:office:office" xmlns:oel="http://schemas.microsoft.com/office/2019/extlst" xmlns:r="http://schemas.openxmlformats.org/officeDocument/2006/relationships" xmlns:m="http://schemas.openxmlformats.org/officeDocument/2006/math" xmlns:v="urn:schemas-microsoft-com:vml" xmlns:wp14="http://schemas.microsoft.com/office/word/2010/wordprocessingDrawing" xmlns:wp="http://schemas.openxmlformats.org/drawingml/2006/wordprocessingDrawing" xmlns:w10="urn:schemas-microsoft-com:office:word" xmlns:w="http://schemas.openxmlformats.org/wordprocessingml/2006/main" xmlns:w14="http://schemas.microsoft.com/office/word/2010/wordml" xmlns:w15="http://schemas.microsoft.com/office/word/2012/wordml" xmlns:w16cei="http://schemas.microsoft.com/office/word/2026/wordml/cei" xmlns:w16cex="http://schemas.microsoft.com/office/word/2018/wordml/cex" xmlns:w16cid="http://schemas.microsoft.com/office/word/2016/wordml/cid" xmlns:w16="http://schemas.microsoft.com/office/word/2018/wordml" xmlns:w16du="http://schemas.microsoft.com/office/word/2023/wordml/word16du" xmlns:w16sdtdh="http://schemas.microsoft.com/office/word/2020/wordml/sdtdatahash" xmlns:w16sdtfl="http://schemas.microsoft.com/office/word/2024/wordml/sdtformatlock" xmlns:w16se="http://schemas.microsoft.com/office/word/2015/wordml/symex" xmlns:wpg="http://schemas.microsoft.com/office/word/2010/wordprocessingGroup" xmlns:wpi="http://schemas.microsoft.com/office/word/2010/wordprocessingInk" xmlns:wne="http://schemas.microsoft.com/office/word/2006/wordml" xmlns:wps="http://schemas.microsoft.com/office/word/2010/wordprocessingShape" mc:Ignorable="w14 w15 w16se w16cid w16 w16cex w16sdtdh w16sdtfl w16du wp14">
   <w:footnote w:type="separator" w:id="-1">
     <w:p>
       <w:pPr>
@@ -2091,7 +2079,7 @@
 </file>
 
 <file path=word/numbering.xml><?xml version="1.0" encoding="utf-8"?>
-<w:numbering xmlns:wpc="http://schemas.microsoft.com/office/word/2010/wordprocessingCanvas" xmlns:cx="http://schemas.microsoft.com/office/drawing/2014/chartex" xmlns:cx1="http://schemas.microsoft.com/office/drawing/2015/9/8/chartex" xmlns:cx2="http://schemas.microsoft.com/office/drawing/2015/10/21/chartex" xmlns:cx3="http://schemas.microsoft.com/office/drawing/2016/5/9/chartex" xmlns:cx4="http://schemas.microsoft.com/office/drawing/2016/5/10/chartex" xmlns:cx5="http://schemas.microsoft.com/office/drawing/2016/5/11/chartex" xmlns:cx6="http://schemas.microsoft.com/office/drawing/2016/5/12/chartex" xmlns:cx7="http://schemas.microsoft.com/office/drawing/2016/5/13/chartex" xmlns:cx8="http://schemas.microsoft.com/office/drawing/2016/5/14/chartex" xmlns:mc="http://schemas.openxmlformats.org/markup-compatibility/2006" xmlns:aink="http://schemas.microsoft.com/office/drawing/2016/ink" xmlns:am3d="http://schemas.microsoft.com/office/drawing/2017/model3d" xmlns:o="urn:schemas-microsoft-com:office:office" xmlns:oel="http://schemas.microsoft.com/office/2019/extlst" xmlns:r="http://schemas.openxmlformats.org/officeDocument/2006/relationships" xmlns:m="http://schemas.openxmlformats.org/officeDocument/2006/math" xmlns:v="urn:schemas-microsoft-com:vml" xmlns:wp14="http://schemas.microsoft.com/office/word/2010/wordprocessingDrawing" xmlns:wp="http://schemas.openxmlformats.org/drawingml/2006/wordprocessingDrawing" xmlns:w10="urn:schemas-microsoft-com:office:word" xmlns:w="http://schemas.openxmlformats.org/wordprocessingml/2006/main" xmlns:w14="http://schemas.microsoft.com/office/word/2010/wordml" xmlns:w15="http://schemas.microsoft.com/office/word/2012/wordml" xmlns:w16cex="http://schemas.microsoft.com/office/word/2018/wordml/cex" xmlns:w16cid="http://schemas.microsoft.com/office/word/2016/wordml/cid" xmlns:w16="http://schemas.microsoft.com/office/word/2018/wordml" xmlns:w16du="http://schemas.microsoft.com/office/word/2023/wordml/word16du" xmlns:w16sdtdh="http://schemas.microsoft.com/office/word/2020/wordml/sdtdatahash" xmlns:w16sdtfl="http://schemas.microsoft.com/office/word/2024/wordml/sdtformatlock" xmlns:w16se="http://schemas.microsoft.com/office/word/2015/wordml/symex" xmlns:wpg="http://schemas.microsoft.com/office/word/2010/wordprocessingGroup" xmlns:wpi="http://schemas.microsoft.com/office/word/2010/wordprocessingInk" xmlns:wne="http://schemas.microsoft.com/office/word/2006/wordml" xmlns:wps="http://schemas.microsoft.com/office/word/2010/wordprocessingShape" mc:Ignorable="w14 w15 w16se w16cid w16 w16cex w16sdtdh w16sdtfl w16du wp14">
+<w:numbering xmlns:wpc="http://schemas.microsoft.com/office/word/2010/wordprocessingCanvas" xmlns:cx="http://schemas.microsoft.com/office/drawing/2014/chartex" xmlns:cx1="http://schemas.microsoft.com/office/drawing/2015/9/8/chartex" xmlns:cx2="http://schemas.microsoft.com/office/drawing/2015/10/21/chartex" xmlns:cx3="http://schemas.microsoft.com/office/drawing/2016/5/9/chartex" xmlns:cx4="http://schemas.microsoft.com/office/drawing/2016/5/10/chartex" xmlns:cx5="http://schemas.microsoft.com/office/drawing/2016/5/11/chartex" xmlns:cx6="http://schemas.microsoft.com/office/drawing/2016/5/12/chartex" xmlns:cx7="http://schemas.microsoft.com/office/drawing/2016/5/13/chartex" xmlns:cx8="http://schemas.microsoft.com/office/drawing/2016/5/14/chartex" xmlns:mc="http://schemas.openxmlformats.org/markup-compatibility/2006" xmlns:aink="http://schemas.microsoft.com/office/drawing/2016/ink" xmlns:am3d="http://schemas.microsoft.com/office/drawing/2017/model3d" xmlns:o="urn:schemas-microsoft-com:office:office" xmlns:oel="http://schemas.microsoft.com/office/2019/extlst" xmlns:r="http://schemas.openxmlformats.org/officeDocument/2006/relationships" xmlns:m="http://schemas.openxmlformats.org/officeDocument/2006/math" xmlns:v="urn:schemas-microsoft-com:vml" xmlns:wp14="http://schemas.microsoft.com/office/word/2010/wordprocessingDrawing" xmlns:wp="http://schemas.openxmlformats.org/drawingml/2006/wordprocessingDrawing" xmlns:w10="urn:schemas-microsoft-com:office:word" xmlns:w="http://schemas.openxmlformats.org/wordprocessingml/2006/main" xmlns:w14="http://schemas.microsoft.com/office/word/2010/wordml" xmlns:w15="http://schemas.microsoft.com/office/word/2012/wordml" xmlns:w16cei="http://schemas.microsoft.com/office/word/2026/wordml/cei" xmlns:w16cex="http://schemas.microsoft.com/office/word/2018/wordml/cex" xmlns:w16cid="http://schemas.microsoft.com/office/word/2016/wordml/cid" xmlns:w16="http://schemas.microsoft.com/office/word/2018/wordml" xmlns:w16du="http://schemas.microsoft.com/office/word/2023/wordml/word16du" xmlns:w16sdtdh="http://schemas.microsoft.com/office/word/2020/wordml/sdtdatahash" xmlns:w16sdtfl="http://schemas.microsoft.com/office/word/2024/wordml/sdtformatlock" xmlns:w16se="http://schemas.microsoft.com/office/word/2015/wordml/symex" xmlns:wpg="http://schemas.microsoft.com/office/word/2010/wordprocessingGroup" xmlns:wpi="http://schemas.microsoft.com/office/word/2010/wordprocessingInk" xmlns:wne="http://schemas.microsoft.com/office/word/2006/wordml" xmlns:wps="http://schemas.microsoft.com/office/word/2010/wordprocessingShape" mc:Ignorable="w14 w15 w16se w16cid w16 w16cex w16sdtdh w16sdtfl w16du wp14">
   <w:abstractNum w:abstractNumId="0" w15:restartNumberingAfterBreak="0">
     <w:nsid w:val="3B056B8E"/>
     <w:multiLevelType w:val="hybridMultilevel"/>

</xml_diff>

<commit_message>
feat(quick-report): cbm defect pages, prpd pipeline and measurements
Add CBM defect page rendering and PRPD fine-tuning pipeline for
multi-technology Quick Reports (Map 100, Tickets 101-106).

- Dynamic OpenXML cell severity shading (#EE0000 / #00B050)
- Ingest testsheet ultrasound and TEV measurements
- UltraTEV survey feeder matching and timestamp selection
- Pure-Python FlatBuffers UE01 and JSON PRPD phase plot decoder
- Part 4 CBM defect detail pages context builder and docxtpl embedding
- End-to-end verification against real inspection datasets (020 TRAS)
- Live pipeline RAW DATA path resolution on WorkspaceStorage

Refs #100, #101, #102, #103, #104, #105, #106
</commit_message>
<xml_diff>
--- a/templates/QUICK REPORT/1. FRONT PAGE TEMPLATE IR BOX Jinja2 updated.docx
+++ b/templates/QUICK REPORT/1. FRONT PAGE TEMPLATE IR BOX Jinja2 updated.docx
@@ -1,6 +1,6 @@
 
 <file path=word/document.xml><?xml version="1.0" encoding="utf-8"?>
-<w:document xmlns:wpc="http://schemas.microsoft.com/office/word/2010/wordprocessingCanvas" xmlns:cx="http://schemas.microsoft.com/office/drawing/2014/chartex" xmlns:cx1="http://schemas.microsoft.com/office/drawing/2015/9/8/chartex" xmlns:cx2="http://schemas.microsoft.com/office/drawing/2015/10/21/chartex" xmlns:cx3="http://schemas.microsoft.com/office/drawing/2016/5/9/chartex" xmlns:cx4="http://schemas.microsoft.com/office/drawing/2016/5/10/chartex" xmlns:cx5="http://schemas.microsoft.com/office/drawing/2016/5/11/chartex" xmlns:cx6="http://schemas.microsoft.com/office/drawing/2016/5/12/chartex" xmlns:cx7="http://schemas.microsoft.com/office/drawing/2016/5/13/chartex" xmlns:cx8="http://schemas.microsoft.com/office/drawing/2016/5/14/chartex" xmlns:mc="http://schemas.openxmlformats.org/markup-compatibility/2006" xmlns:aink="http://schemas.microsoft.com/office/drawing/2016/ink" xmlns:am3d="http://schemas.microsoft.com/office/drawing/2017/model3d" xmlns:o="urn:schemas-microsoft-com:office:office" xmlns:oel="http://schemas.microsoft.com/office/2019/extlst" xmlns:r="http://schemas.openxmlformats.org/officeDocument/2006/relationships" xmlns:m="http://schemas.openxmlformats.org/officeDocument/2006/math" xmlns:v="urn:schemas-microsoft-com:vml" xmlns:wp14="http://schemas.microsoft.com/office/word/2010/wordprocessingDrawing" xmlns:wp="http://schemas.openxmlformats.org/drawingml/2006/wordprocessingDrawing" xmlns:w10="urn:schemas-microsoft-com:office:word" xmlns:w="http://schemas.openxmlformats.org/wordprocessingml/2006/main" xmlns:w14="http://schemas.microsoft.com/office/word/2010/wordml" xmlns:w15="http://schemas.microsoft.com/office/word/2012/wordml" xmlns:w16cei="http://schemas.microsoft.com/office/word/2026/wordml/cei" xmlns:w16cex="http://schemas.microsoft.com/office/word/2018/wordml/cex" xmlns:w16cid="http://schemas.microsoft.com/office/word/2016/wordml/cid" xmlns:w16="http://schemas.microsoft.com/office/word/2018/wordml" xmlns:w16du="http://schemas.microsoft.com/office/word/2023/wordml/word16du" xmlns:w16sdtdh="http://schemas.microsoft.com/office/word/2020/wordml/sdtdatahash" xmlns:w16sdtfl="http://schemas.microsoft.com/office/word/2024/wordml/sdtformatlock" xmlns:w16se="http://schemas.microsoft.com/office/word/2015/wordml/symex" xmlns:wpg="http://schemas.microsoft.com/office/word/2010/wordprocessingGroup" xmlns:wpi="http://schemas.microsoft.com/office/word/2010/wordprocessingInk" xmlns:wne="http://schemas.microsoft.com/office/word/2006/wordml" xmlns:wps="http://schemas.microsoft.com/office/word/2010/wordprocessingShape" mc:Ignorable="w14 w15 w16se w16cid w16 w16cex w16sdtdh w16sdtfl w16du wp14">
+<w:document xmlns:wpc="http://schemas.microsoft.com/office/word/2010/wordprocessingCanvas" xmlns:cx="http://schemas.microsoft.com/office/drawing/2014/chartex" xmlns:cx1="http://schemas.microsoft.com/office/drawing/2015/9/8/chartex" xmlns:cx2="http://schemas.microsoft.com/office/drawing/2015/10/21/chartex" xmlns:cx3="http://schemas.microsoft.com/office/drawing/2016/5/9/chartex" xmlns:cx4="http://schemas.microsoft.com/office/drawing/2016/5/10/chartex" xmlns:cx5="http://schemas.microsoft.com/office/drawing/2016/5/11/chartex" xmlns:cx6="http://schemas.microsoft.com/office/drawing/2016/5/12/chartex" xmlns:cx7="http://schemas.microsoft.com/office/drawing/2016/5/13/chartex" xmlns:cx8="http://schemas.microsoft.com/office/drawing/2016/5/14/chartex" xmlns:mc="http://schemas.openxmlformats.org/markup-compatibility/2006" xmlns:aink="http://schemas.microsoft.com/office/drawing/2016/ink" xmlns:am3d="http://schemas.microsoft.com/office/drawing/2017/model3d" xmlns:o="urn:schemas-microsoft-com:office:office" xmlns:oel="http://schemas.microsoft.com/office/2019/extlst" xmlns:r="http://schemas.openxmlformats.org/officeDocument/2006/relationships" xmlns:m="http://schemas.openxmlformats.org/officeDocument/2006/math" xmlns:v="urn:schemas-microsoft-com:vml" xmlns:wp14="http://schemas.microsoft.com/office/word/2010/wordprocessingDrawing" xmlns:wp="http://schemas.openxmlformats.org/drawingml/2006/wordprocessingDrawing" xmlns:w10="urn:schemas-microsoft-com:office:word" xmlns:w="http://schemas.openxmlformats.org/wordprocessingml/2006/main" xmlns:w14="http://schemas.microsoft.com/office/word/2010/wordml" xmlns:w15="http://schemas.microsoft.com/office/word/2012/wordml" xmlns:w16cex="http://schemas.microsoft.com/office/word/2018/wordml/cex" xmlns:w16cid="http://schemas.microsoft.com/office/word/2016/wordml/cid" xmlns:w16="http://schemas.microsoft.com/office/word/2018/wordml" xmlns:w16du="http://schemas.microsoft.com/office/word/2023/wordml/word16du" xmlns:w16sdtdh="http://schemas.microsoft.com/office/word/2020/wordml/sdtdatahash" xmlns:w16sdtfl="http://schemas.microsoft.com/office/word/2024/wordml/sdtformatlock" xmlns:w16se="http://schemas.microsoft.com/office/word/2015/wordml/symex" xmlns:wpg="http://schemas.microsoft.com/office/word/2010/wordprocessingGroup" xmlns:wpi="http://schemas.microsoft.com/office/word/2010/wordprocessingInk" xmlns:wne="http://schemas.microsoft.com/office/word/2006/wordml" xmlns:wps="http://schemas.microsoft.com/office/word/2010/wordprocessingShape" mc:Ignorable="w14 w15 w16se w16cid w16 w16cex w16sdtdh w16sdtfl w16du wp14">
   <w:body>
     <w:tbl>
       <w:tblPr>
@@ -166,7 +166,7 @@
                 <w:lang w:eastAsia="en-MY"/>
               </w:rPr>
               <w:drawing>
-                <wp:inline distT="0" distB="0" distL="0" distR="0" wp14:anchorId="7D93C327" wp14:editId="041B1214">
+                <wp:inline distT="0" distB="0" distL="0" distR="0" wp14:anchorId="7D93C327" wp14:editId="668C1DD4">
                   <wp:extent cx="2286000" cy="649224"/>
                   <wp:effectExtent l="0" t="0" r="0" b="0"/>
                   <wp:docPr id="4" name="Picture 4" descr="D:\Work Documents\Template\Logo\New EET Logo Final _Color.png"/>
@@ -299,25 +299,7 @@
           <w:sz w:val="32"/>
           <w:szCs w:val="32"/>
         </w:rPr>
-        <w:t xml:space="preserve">SBUM DIAGNOSTIC </w:t>
-      </w:r>
-      <w:r>
-        <w:rPr>
-          <w:rFonts w:cstheme="minorHAnsi"/>
-          <w:b/>
-          <w:sz w:val="32"/>
-          <w:szCs w:val="32"/>
-        </w:rPr>
-        <w:t>{{ SUBSTATION.STATE }}</w:t>
-      </w:r>
-      <w:r>
-        <w:rPr>
-          <w:rFonts w:cstheme="minorHAnsi"/>
-          <w:b/>
-          <w:sz w:val="32"/>
-          <w:szCs w:val="32"/>
-        </w:rPr>
-        <w:t xml:space="preserve"> </w:t>
+        <w:t xml:space="preserve">SBUM DIAGNOSTIC {{ SUBSTATION.STATE }} </w:t>
       </w:r>
     </w:p>
     <w:p>
@@ -338,16 +320,7 @@
           <w:sz w:val="32"/>
           <w:szCs w:val="32"/>
         </w:rPr>
-        <w:t xml:space="preserve">TNB BAHAGIAN PEMBAHAGIAN </w:t>
-      </w:r>
-      <w:r>
-        <w:rPr>
-          <w:rFonts w:cstheme="minorHAnsi"/>
-          <w:b/>
-          <w:sz w:val="32"/>
-          <w:szCs w:val="32"/>
-        </w:rPr>
-        <w:t>{{ SUBSTATION.STATE }}</w:t>
+        <w:t>TNB BAHAGIAN PEMBAHAGIAN {{ SUBSTATION.STATE }}</w:t>
       </w:r>
     </w:p>
     <w:p>
@@ -436,13 +409,7 @@
               <w:rPr>
                 <w:rFonts w:cstheme="minorHAnsi"/>
               </w:rPr>
-              <w:t>substation.</w:t>
-            </w:r>
-            <w:r>
-              <w:rPr>
-                <w:rFonts w:cstheme="minorHAnsi"/>
-              </w:rPr>
-              <w:t>fl_erms</w:t>
+              <w:t>substation.fl_erms</w:t>
             </w:r>
             <w:proofErr w:type="spellEnd"/>
             <w:r>
@@ -515,19 +482,7 @@
               <w:rPr>
                 <w:rFonts w:cstheme="minorHAnsi"/>
               </w:rPr>
-              <w:t>substation.</w:t>
-            </w:r>
-            <w:r>
-              <w:rPr>
-                <w:rFonts w:cstheme="minorHAnsi"/>
-              </w:rPr>
-              <w:t>fl_sit</w:t>
-            </w:r>
-            <w:r>
-              <w:rPr>
-                <w:rFonts w:cstheme="minorHAnsi"/>
-              </w:rPr>
-              <w:t>e</w:t>
+              <w:t>substation.fl_site</w:t>
             </w:r>
             <w:proofErr w:type="spellEnd"/>
             <w:r>
@@ -819,13 +774,7 @@
               <w:rPr>
                 <w:rFonts w:cstheme="minorHAnsi"/>
               </w:rPr>
-              <w:t>substation.t</w:t>
-            </w:r>
-            <w:r>
-              <w:rPr>
-                <w:rFonts w:cstheme="minorHAnsi"/>
-              </w:rPr>
-              <w:t>ype</w:t>
+              <w:t>substation.type</w:t>
             </w:r>
             <w:proofErr w:type="spellEnd"/>
             <w:r>
@@ -1559,21 +1508,7 @@
                 <w:rFonts w:cstheme="minorHAnsi"/>
                 <w:lang w:val="en-US" w:eastAsia="en-MY"/>
               </w:rPr>
-              <w:t>CALIB</w:t>
-            </w:r>
-            <w:r>
-              <w:rPr>
-                <w:rFonts w:cstheme="minorHAnsi"/>
-                <w:lang w:val="en-US" w:eastAsia="en-MY"/>
-              </w:rPr>
-              <w:t>RATION</w:t>
-            </w:r>
-            <w:r>
-              <w:rPr>
-                <w:rFonts w:cstheme="minorHAnsi"/>
-                <w:lang w:val="en-US" w:eastAsia="en-MY"/>
-              </w:rPr>
-              <w:t xml:space="preserve"> DUE DATE: 26 DEC 2026</w:t>
+              <w:t>CALIBRATION DUE DATE: 26 DEC 2026</w:t>
             </w:r>
             <w:r>
               <w:rPr>
@@ -2029,7 +1964,7 @@
 </file>
 
 <file path=word/endnotes.xml><?xml version="1.0" encoding="utf-8"?>
-<w:endnotes xmlns:wpc="http://schemas.microsoft.com/office/word/2010/wordprocessingCanvas" xmlns:cx="http://schemas.microsoft.com/office/drawing/2014/chartex" xmlns:cx1="http://schemas.microsoft.com/office/drawing/2015/9/8/chartex" xmlns:cx2="http://schemas.microsoft.com/office/drawing/2015/10/21/chartex" xmlns:cx3="http://schemas.microsoft.com/office/drawing/2016/5/9/chartex" xmlns:cx4="http://schemas.microsoft.com/office/drawing/2016/5/10/chartex" xmlns:cx5="http://schemas.microsoft.com/office/drawing/2016/5/11/chartex" xmlns:cx6="http://schemas.microsoft.com/office/drawing/2016/5/12/chartex" xmlns:cx7="http://schemas.microsoft.com/office/drawing/2016/5/13/chartex" xmlns:cx8="http://schemas.microsoft.com/office/drawing/2016/5/14/chartex" xmlns:mc="http://schemas.openxmlformats.org/markup-compatibility/2006" xmlns:aink="http://schemas.microsoft.com/office/drawing/2016/ink" xmlns:am3d="http://schemas.microsoft.com/office/drawing/2017/model3d" xmlns:o="urn:schemas-microsoft-com:office:office" xmlns:oel="http://schemas.microsoft.com/office/2019/extlst" xmlns:r="http://schemas.openxmlformats.org/officeDocument/2006/relationships" xmlns:m="http://schemas.openxmlformats.org/officeDocument/2006/math" xmlns:v="urn:schemas-microsoft-com:vml" xmlns:wp14="http://schemas.microsoft.com/office/word/2010/wordprocessingDrawing" xmlns:wp="http://schemas.openxmlformats.org/drawingml/2006/wordprocessingDrawing" xmlns:w10="urn:schemas-microsoft-com:office:word" xmlns:w="http://schemas.openxmlformats.org/wordprocessingml/2006/main" xmlns:w14="http://schemas.microsoft.com/office/word/2010/wordml" xmlns:w15="http://schemas.microsoft.com/office/word/2012/wordml" xmlns:w16cei="http://schemas.microsoft.com/office/word/2026/wordml/cei" xmlns:w16cex="http://schemas.microsoft.com/office/word/2018/wordml/cex" xmlns:w16cid="http://schemas.microsoft.com/office/word/2016/wordml/cid" xmlns:w16="http://schemas.microsoft.com/office/word/2018/wordml" xmlns:w16du="http://schemas.microsoft.com/office/word/2023/wordml/word16du" xmlns:w16sdtdh="http://schemas.microsoft.com/office/word/2020/wordml/sdtdatahash" xmlns:w16sdtfl="http://schemas.microsoft.com/office/word/2024/wordml/sdtformatlock" xmlns:w16se="http://schemas.microsoft.com/office/word/2015/wordml/symex" xmlns:wpg="http://schemas.microsoft.com/office/word/2010/wordprocessingGroup" xmlns:wpi="http://schemas.microsoft.com/office/word/2010/wordprocessingInk" xmlns:wne="http://schemas.microsoft.com/office/word/2006/wordml" xmlns:wps="http://schemas.microsoft.com/office/word/2010/wordprocessingShape" mc:Ignorable="w14 w15 w16se w16cid w16 w16cex w16sdtdh w16sdtfl w16du wp14">
+<w:endnotes xmlns:wpc="http://schemas.microsoft.com/office/word/2010/wordprocessingCanvas" xmlns:cx="http://schemas.microsoft.com/office/drawing/2014/chartex" xmlns:cx1="http://schemas.microsoft.com/office/drawing/2015/9/8/chartex" xmlns:cx2="http://schemas.microsoft.com/office/drawing/2015/10/21/chartex" xmlns:cx3="http://schemas.microsoft.com/office/drawing/2016/5/9/chartex" xmlns:cx4="http://schemas.microsoft.com/office/drawing/2016/5/10/chartex" xmlns:cx5="http://schemas.microsoft.com/office/drawing/2016/5/11/chartex" xmlns:cx6="http://schemas.microsoft.com/office/drawing/2016/5/12/chartex" xmlns:cx7="http://schemas.microsoft.com/office/drawing/2016/5/13/chartex" xmlns:cx8="http://schemas.microsoft.com/office/drawing/2016/5/14/chartex" xmlns:mc="http://schemas.openxmlformats.org/markup-compatibility/2006" xmlns:aink="http://schemas.microsoft.com/office/drawing/2016/ink" xmlns:am3d="http://schemas.microsoft.com/office/drawing/2017/model3d" xmlns:o="urn:schemas-microsoft-com:office:office" xmlns:oel="http://schemas.microsoft.com/office/2019/extlst" xmlns:r="http://schemas.openxmlformats.org/officeDocument/2006/relationships" xmlns:m="http://schemas.openxmlformats.org/officeDocument/2006/math" xmlns:v="urn:schemas-microsoft-com:vml" xmlns:wp14="http://schemas.microsoft.com/office/word/2010/wordprocessingDrawing" xmlns:wp="http://schemas.openxmlformats.org/drawingml/2006/wordprocessingDrawing" xmlns:w10="urn:schemas-microsoft-com:office:word" xmlns:w="http://schemas.openxmlformats.org/wordprocessingml/2006/main" xmlns:w14="http://schemas.microsoft.com/office/word/2010/wordml" xmlns:w15="http://schemas.microsoft.com/office/word/2012/wordml" xmlns:w16cex="http://schemas.microsoft.com/office/word/2018/wordml/cex" xmlns:w16cid="http://schemas.microsoft.com/office/word/2016/wordml/cid" xmlns:w16="http://schemas.microsoft.com/office/word/2018/wordml" xmlns:w16du="http://schemas.microsoft.com/office/word/2023/wordml/word16du" xmlns:w16sdtdh="http://schemas.microsoft.com/office/word/2020/wordml/sdtdatahash" xmlns:w16sdtfl="http://schemas.microsoft.com/office/word/2024/wordml/sdtformatlock" xmlns:w16se="http://schemas.microsoft.com/office/word/2015/wordml/symex" xmlns:wpg="http://schemas.microsoft.com/office/word/2010/wordprocessingGroup" xmlns:wpi="http://schemas.microsoft.com/office/word/2010/wordprocessingInk" xmlns:wne="http://schemas.microsoft.com/office/word/2006/wordml" xmlns:wps="http://schemas.microsoft.com/office/word/2010/wordprocessingShape" mc:Ignorable="w14 w15 w16se w16cid w16 w16cex w16sdtdh w16sdtfl w16du wp14">
   <w:endnote w:type="separator" w:id="-1">
     <w:p>
       <w:pPr>
@@ -2054,7 +1989,7 @@
 </file>
 
 <file path=word/footnotes.xml><?xml version="1.0" encoding="utf-8"?>
-<w:footnotes xmlns:wpc="http://schemas.microsoft.com/office/word/2010/wordprocessingCanvas" xmlns:cx="http://schemas.microsoft.com/office/drawing/2014/chartex" xmlns:cx1="http://schemas.microsoft.com/office/drawing/2015/9/8/chartex" xmlns:cx2="http://schemas.microsoft.com/office/drawing/2015/10/21/chartex" xmlns:cx3="http://schemas.microsoft.com/office/drawing/2016/5/9/chartex" xmlns:cx4="http://schemas.microsoft.com/office/drawing/2016/5/10/chartex" xmlns:cx5="http://schemas.microsoft.com/office/drawing/2016/5/11/chartex" xmlns:cx6="http://schemas.microsoft.com/office/drawing/2016/5/12/chartex" xmlns:cx7="http://schemas.microsoft.com/office/drawing/2016/5/13/chartex" xmlns:cx8="http://schemas.microsoft.com/office/drawing/2016/5/14/chartex" xmlns:mc="http://schemas.openxmlformats.org/markup-compatibility/2006" xmlns:aink="http://schemas.microsoft.com/office/drawing/2016/ink" xmlns:am3d="http://schemas.microsoft.com/office/drawing/2017/model3d" xmlns:o="urn:schemas-microsoft-com:office:office" xmlns:oel="http://schemas.microsoft.com/office/2019/extlst" xmlns:r="http://schemas.openxmlformats.org/officeDocument/2006/relationships" xmlns:m="http://schemas.openxmlformats.org/officeDocument/2006/math" xmlns:v="urn:schemas-microsoft-com:vml" xmlns:wp14="http://schemas.microsoft.com/office/word/2010/wordprocessingDrawing" xmlns:wp="http://schemas.openxmlformats.org/drawingml/2006/wordprocessingDrawing" xmlns:w10="urn:schemas-microsoft-com:office:word" xmlns:w="http://schemas.openxmlformats.org/wordprocessingml/2006/main" xmlns:w14="http://schemas.microsoft.com/office/word/2010/wordml" xmlns:w15="http://schemas.microsoft.com/office/word/2012/wordml" xmlns:w16cei="http://schemas.microsoft.com/office/word/2026/wordml/cei" xmlns:w16cex="http://schemas.microsoft.com/office/word/2018/wordml/cex" xmlns:w16cid="http://schemas.microsoft.com/office/word/2016/wordml/cid" xmlns:w16="http://schemas.microsoft.com/office/word/2018/wordml" xmlns:w16du="http://schemas.microsoft.com/office/word/2023/wordml/word16du" xmlns:w16sdtdh="http://schemas.microsoft.com/office/word/2020/wordml/sdtdatahash" xmlns:w16sdtfl="http://schemas.microsoft.com/office/word/2024/wordml/sdtformatlock" xmlns:w16se="http://schemas.microsoft.com/office/word/2015/wordml/symex" xmlns:wpg="http://schemas.microsoft.com/office/word/2010/wordprocessingGroup" xmlns:wpi="http://schemas.microsoft.com/office/word/2010/wordprocessingInk" xmlns:wne="http://schemas.microsoft.com/office/word/2006/wordml" xmlns:wps="http://schemas.microsoft.com/office/word/2010/wordprocessingShape" mc:Ignorable="w14 w15 w16se w16cid w16 w16cex w16sdtdh w16sdtfl w16du wp14">
+<w:footnotes xmlns:wpc="http://schemas.microsoft.com/office/word/2010/wordprocessingCanvas" xmlns:cx="http://schemas.microsoft.com/office/drawing/2014/chartex" xmlns:cx1="http://schemas.microsoft.com/office/drawing/2015/9/8/chartex" xmlns:cx2="http://schemas.microsoft.com/office/drawing/2015/10/21/chartex" xmlns:cx3="http://schemas.microsoft.com/office/drawing/2016/5/9/chartex" xmlns:cx4="http://schemas.microsoft.com/office/drawing/2016/5/10/chartex" xmlns:cx5="http://schemas.microsoft.com/office/drawing/2016/5/11/chartex" xmlns:cx6="http://schemas.microsoft.com/office/drawing/2016/5/12/chartex" xmlns:cx7="http://schemas.microsoft.com/office/drawing/2016/5/13/chartex" xmlns:cx8="http://schemas.microsoft.com/office/drawing/2016/5/14/chartex" xmlns:mc="http://schemas.openxmlformats.org/markup-compatibility/2006" xmlns:aink="http://schemas.microsoft.com/office/drawing/2016/ink" xmlns:am3d="http://schemas.microsoft.com/office/drawing/2017/model3d" xmlns:o="urn:schemas-microsoft-com:office:office" xmlns:oel="http://schemas.microsoft.com/office/2019/extlst" xmlns:r="http://schemas.openxmlformats.org/officeDocument/2006/relationships" xmlns:m="http://schemas.openxmlformats.org/officeDocument/2006/math" xmlns:v="urn:schemas-microsoft-com:vml" xmlns:wp14="http://schemas.microsoft.com/office/word/2010/wordprocessingDrawing" xmlns:wp="http://schemas.openxmlformats.org/drawingml/2006/wordprocessingDrawing" xmlns:w10="urn:schemas-microsoft-com:office:word" xmlns:w="http://schemas.openxmlformats.org/wordprocessingml/2006/main" xmlns:w14="http://schemas.microsoft.com/office/word/2010/wordml" xmlns:w15="http://schemas.microsoft.com/office/word/2012/wordml" xmlns:w16cex="http://schemas.microsoft.com/office/word/2018/wordml/cex" xmlns:w16cid="http://schemas.microsoft.com/office/word/2016/wordml/cid" xmlns:w16="http://schemas.microsoft.com/office/word/2018/wordml" xmlns:w16du="http://schemas.microsoft.com/office/word/2023/wordml/word16du" xmlns:w16sdtdh="http://schemas.microsoft.com/office/word/2020/wordml/sdtdatahash" xmlns:w16sdtfl="http://schemas.microsoft.com/office/word/2024/wordml/sdtformatlock" xmlns:w16se="http://schemas.microsoft.com/office/word/2015/wordml/symex" xmlns:wpg="http://schemas.microsoft.com/office/word/2010/wordprocessingGroup" xmlns:wpi="http://schemas.microsoft.com/office/word/2010/wordprocessingInk" xmlns:wne="http://schemas.microsoft.com/office/word/2006/wordml" xmlns:wps="http://schemas.microsoft.com/office/word/2010/wordprocessingShape" mc:Ignorable="w14 w15 w16se w16cid w16 w16cex w16sdtdh w16sdtfl w16du wp14">
   <w:footnote w:type="separator" w:id="-1">
     <w:p>
       <w:pPr>
@@ -2079,7 +2014,7 @@
 </file>
 
 <file path=word/numbering.xml><?xml version="1.0" encoding="utf-8"?>
-<w:numbering xmlns:wpc="http://schemas.microsoft.com/office/word/2010/wordprocessingCanvas" xmlns:cx="http://schemas.microsoft.com/office/drawing/2014/chartex" xmlns:cx1="http://schemas.microsoft.com/office/drawing/2015/9/8/chartex" xmlns:cx2="http://schemas.microsoft.com/office/drawing/2015/10/21/chartex" xmlns:cx3="http://schemas.microsoft.com/office/drawing/2016/5/9/chartex" xmlns:cx4="http://schemas.microsoft.com/office/drawing/2016/5/10/chartex" xmlns:cx5="http://schemas.microsoft.com/office/drawing/2016/5/11/chartex" xmlns:cx6="http://schemas.microsoft.com/office/drawing/2016/5/12/chartex" xmlns:cx7="http://schemas.microsoft.com/office/drawing/2016/5/13/chartex" xmlns:cx8="http://schemas.microsoft.com/office/drawing/2016/5/14/chartex" xmlns:mc="http://schemas.openxmlformats.org/markup-compatibility/2006" xmlns:aink="http://schemas.microsoft.com/office/drawing/2016/ink" xmlns:am3d="http://schemas.microsoft.com/office/drawing/2017/model3d" xmlns:o="urn:schemas-microsoft-com:office:office" xmlns:oel="http://schemas.microsoft.com/office/2019/extlst" xmlns:r="http://schemas.openxmlformats.org/officeDocument/2006/relationships" xmlns:m="http://schemas.openxmlformats.org/officeDocument/2006/math" xmlns:v="urn:schemas-microsoft-com:vml" xmlns:wp14="http://schemas.microsoft.com/office/word/2010/wordprocessingDrawing" xmlns:wp="http://schemas.openxmlformats.org/drawingml/2006/wordprocessingDrawing" xmlns:w10="urn:schemas-microsoft-com:office:word" xmlns:w="http://schemas.openxmlformats.org/wordprocessingml/2006/main" xmlns:w14="http://schemas.microsoft.com/office/word/2010/wordml" xmlns:w15="http://schemas.microsoft.com/office/word/2012/wordml" xmlns:w16cei="http://schemas.microsoft.com/office/word/2026/wordml/cei" xmlns:w16cex="http://schemas.microsoft.com/office/word/2018/wordml/cex" xmlns:w16cid="http://schemas.microsoft.com/office/word/2016/wordml/cid" xmlns:w16="http://schemas.microsoft.com/office/word/2018/wordml" xmlns:w16du="http://schemas.microsoft.com/office/word/2023/wordml/word16du" xmlns:w16sdtdh="http://schemas.microsoft.com/office/word/2020/wordml/sdtdatahash" xmlns:w16sdtfl="http://schemas.microsoft.com/office/word/2024/wordml/sdtformatlock" xmlns:w16se="http://schemas.microsoft.com/office/word/2015/wordml/symex" xmlns:wpg="http://schemas.microsoft.com/office/word/2010/wordprocessingGroup" xmlns:wpi="http://schemas.microsoft.com/office/word/2010/wordprocessingInk" xmlns:wne="http://schemas.microsoft.com/office/word/2006/wordml" xmlns:wps="http://schemas.microsoft.com/office/word/2010/wordprocessingShape" mc:Ignorable="w14 w15 w16se w16cid w16 w16cex w16sdtdh w16sdtfl w16du wp14">
+<w:numbering xmlns:wpc="http://schemas.microsoft.com/office/word/2010/wordprocessingCanvas" xmlns:cx="http://schemas.microsoft.com/office/drawing/2014/chartex" xmlns:cx1="http://schemas.microsoft.com/office/drawing/2015/9/8/chartex" xmlns:cx2="http://schemas.microsoft.com/office/drawing/2015/10/21/chartex" xmlns:cx3="http://schemas.microsoft.com/office/drawing/2016/5/9/chartex" xmlns:cx4="http://schemas.microsoft.com/office/drawing/2016/5/10/chartex" xmlns:cx5="http://schemas.microsoft.com/office/drawing/2016/5/11/chartex" xmlns:cx6="http://schemas.microsoft.com/office/drawing/2016/5/12/chartex" xmlns:cx7="http://schemas.microsoft.com/office/drawing/2016/5/13/chartex" xmlns:cx8="http://schemas.microsoft.com/office/drawing/2016/5/14/chartex" xmlns:mc="http://schemas.openxmlformats.org/markup-compatibility/2006" xmlns:aink="http://schemas.microsoft.com/office/drawing/2016/ink" xmlns:am3d="http://schemas.microsoft.com/office/drawing/2017/model3d" xmlns:o="urn:schemas-microsoft-com:office:office" xmlns:oel="http://schemas.microsoft.com/office/2019/extlst" xmlns:r="http://schemas.openxmlformats.org/officeDocument/2006/relationships" xmlns:m="http://schemas.openxmlformats.org/officeDocument/2006/math" xmlns:v="urn:schemas-microsoft-com:vml" xmlns:wp14="http://schemas.microsoft.com/office/word/2010/wordprocessingDrawing" xmlns:wp="http://schemas.openxmlformats.org/drawingml/2006/wordprocessingDrawing" xmlns:w10="urn:schemas-microsoft-com:office:word" xmlns:w="http://schemas.openxmlformats.org/wordprocessingml/2006/main" xmlns:w14="http://schemas.microsoft.com/office/word/2010/wordml" xmlns:w15="http://schemas.microsoft.com/office/word/2012/wordml" xmlns:w16cex="http://schemas.microsoft.com/office/word/2018/wordml/cex" xmlns:w16cid="http://schemas.microsoft.com/office/word/2016/wordml/cid" xmlns:w16="http://schemas.microsoft.com/office/word/2018/wordml" xmlns:w16du="http://schemas.microsoft.com/office/word/2023/wordml/word16du" xmlns:w16sdtdh="http://schemas.microsoft.com/office/word/2020/wordml/sdtdatahash" xmlns:w16sdtfl="http://schemas.microsoft.com/office/word/2024/wordml/sdtformatlock" xmlns:w16se="http://schemas.microsoft.com/office/word/2015/wordml/symex" xmlns:wpg="http://schemas.microsoft.com/office/word/2010/wordprocessingGroup" xmlns:wpi="http://schemas.microsoft.com/office/word/2010/wordprocessingInk" xmlns:wne="http://schemas.microsoft.com/office/word/2006/wordml" xmlns:wps="http://schemas.microsoft.com/office/word/2010/wordprocessingShape" mc:Ignorable="w14 w15 w16se w16cid w16 w16cex w16sdtdh w16sdtfl w16du wp14">
   <w:abstractNum w:abstractNumId="0" w15:restartNumberingAfterBreak="0">
     <w:nsid w:val="3B056B8E"/>
     <w:multiLevelType w:val="hybridMultilevel"/>

</xml_diff>